<commit_message>
Ladeklar: Social-Media-Bilder zu den LinkedIn-Posts, Sprachangaben vereinheitlicht (8 Sprachen)
Co-Authored-By: Claude Opus 5.5 <noreply@anthropic.com>
Claude-Session: https://claude.ai/code/session_01EZAJU4yFY1ubUt7FTVW4st
</commit_message>
<xml_diff>
--- a/ladeklar/business/pdf/BUSINESSPLAN.docx
+++ b/ladeklar/business/pdf/BUSINESSPLAN.docx
@@ -2102,7 +2102,7 @@
               <w:t xml:space="preserve">Zwischenstopps/Sammeltouren</w:t>
             </w:r>
             <w:r>
-              <w:t xml:space="preserve">, Kundenportal mit Sendungsverfolgungs-Link, Webhooks, Sprachen</w:t>
+              <w:t xml:space="preserve">, Kundenportal mit Sendungsverfolgungs-Link, Webhooks, Sprache</w:t>
             </w:r>
             <w:r>
               <w:t xml:space="preserve"> </w:t>
@@ -2112,10 +2112,13 @@
                 <w:bCs/>
                 <w:b/>
               </w:rPr>
-              <w:t xml:space="preserve">Tschechisch und Bulgarisch</w:t>
-            </w:r>
-            <w:r>
-              <w:t xml:space="preserve">,</w:t>
+              <w:t xml:space="preserve">Bulgarisch</w:t>
+            </w:r>
+            <w:r>
+              <w:t xml:space="preserve"> </w:t>
+            </w:r>
+            <w:r>
+              <w:t xml:space="preserve">(Tschechisch ist seit v1.0 enthalten),</w:t>
             </w:r>
             <w:r>
               <w:t xml:space="preserve"> </w:t>

</xml_diff>

<commit_message>
Ladeklar 1.0: abgabebereit – Unit/API 132/132, E2E 37/37, alle Dokumente neu erzeugt
- Handbuch-PDFs jetzt mit allen Bildschirmfotos (Rendering aus Datei, Abbruch bei fehlendem Bild)
- Bildschirmfotos neu, inkl. aller 8 Sprachen und Fahrer-Tablet
- Rechtstexte, Businessplan, Marktanalyse, Werbetexte (PDF/DOCX), Pitch-Deck (PPTX/PDF),
  Flyer, Postkarte, Social-Bilder, Testbericht und Plan neu gebaut
- Website und Online-Demo neu gebaut
- Testserver mit höherem Login-Limit (der echte Server bleibt bei 20 je Minute)

Co-Authored-By: Claude Opus 5.5 <noreply@anthropic.com>
Claude-Session: https://claude.ai/code/session_01EZAJU4yFY1ubUt7FTVW4st
</commit_message>
<xml_diff>
--- a/ladeklar/business/pdf/BUSINESSPLAN.docx
+++ b/ladeklar/business/pdf/BUSINESSPLAN.docx
@@ -494,13 +494,19 @@
         <w:t xml:space="preserve"> </w:t>
       </w:r>
       <w:r>
-        <w:t xml:space="preserve">Push-Mitteilung. Keine Hardware, Einführung in 10 Minuten, Fahrer-App in 8 Sprachen, unter dem Logo des Kunden.</w:t>
+        <w:t xml:space="preserve">Push-Mitteilung. Keine Hardware, Einrichtung in etwa 10 Minuten, Fahrer-App in 8 Sprachen, unter dem Logo des Kunden.</w:t>
       </w:r>
       <w:r>
         <w:t xml:space="preserve"> </w:t>
       </w:r>
       <w:r>
-        <w:t xml:space="preserve">Standort nur im Moment eines Statuswechsels und nur, wenn der Betrieb es einschaltet – keine Dauerortung.</w:t>
+        <w:t xml:space="preserve">Standort nur im Moment eines Statuswechsels und nur, wenn der Betrieb es einschaltet und der Fahrer zustimmt – keine</w:t>
+      </w:r>
+      <w:r>
+        <w:t xml:space="preserve"> </w:t>
+      </w:r>
+      <w:r>
+        <w:t xml:space="preserve">Dauerortung.</w:t>
       </w:r>
     </w:p>
     <w:p>
@@ -1260,19 +1266,19 @@
               <w:jc w:val="left"/>
             </w:pPr>
             <w:r>
-              <w:t xml:space="preserve">der Gründer, später das Ladeklar-Team (geplant als GmbH)</w:t>
-            </w:r>
-          </w:p>
-        </w:tc>
-        <w:tc>
-          <w:tcPr/>
-          <w:p>
-            <w:pPr>
-              <w:pStyle w:val="Compact"/>
-              <w:jc w:val="left"/>
-            </w:pPr>
-            <w:r>
-              <w:t xml:space="preserve">betreibt die Plattform, legt Lizenzen an, setzt Tarif, Plätze, Laufzeit, Branding; sieht Kennzahlen und Abrechnung,</w:t>
+              <w:t xml:space="preserve">der Gründer, später das Ladeklar-Team (geplant als GmbH; die Konsole hat heute genau einen Lizenzgeber-Zugang)</w:t>
+            </w:r>
+          </w:p>
+        </w:tc>
+        <w:tc>
+          <w:tcPr/>
+          <w:p>
+            <w:pPr>
+              <w:pStyle w:val="Compact"/>
+              <w:jc w:val="left"/>
+            </w:pPr>
+            <w:r>
+              <w:t xml:space="preserve">betreibt die Plattform, legt Lizenzen an, setzt Tarif, Plätze, Laufzeit, Zahlweise und Markenfarbe, pflegt Firmendaten, setzt bei Bedarf das Admin-Passwort des Kunden zurück; sieht Kennzahlen und Abrechnung,</w:t>
             </w:r>
             <w:r>
               <w:t xml:space="preserve"> </w:t>
@@ -1454,13 +1460,13 @@
         <w:t xml:space="preserve">Verantwortlicher</w:t>
       </w:r>
       <w:r>
-        <w:t xml:space="preserve">. Support-Zugriff auf Kundendaten gibt es nur nach Freigabe durch den Kunden, zeitlich</w:t>
+        <w:t xml:space="preserve">. Die Konsole zeigt keine Auftragsdaten. Der Kunde kann eine befristete Support-Freigabe</w:t>
       </w:r>
       <w:r>
         <w:t xml:space="preserve"> </w:t>
       </w:r>
       <w:r>
-        <w:t xml:space="preserve">begrenzt und protokolliert (PLAN.md Kap. 2).</w:t>
+        <w:t xml:space="preserve">erteilen; sie wird protokolliert, öffnet aber keinen Zugriff auf Kundendaten in der Konsole (PLAN.md Kap. 2).</w:t>
       </w:r>
     </w:p>
     <w:bookmarkEnd w:id="22"/>
@@ -1752,7 +1758,19 @@
         <w:t xml:space="preserve"> </w:t>
       </w:r>
       <w:r>
-        <w:t xml:space="preserve">für den Lizenzgeber: Lizenznehmer anlegen, Tarif, Plätze, Laufzeit, Status, Branding, MRR-Übersicht.</w:t>
+        <w:t xml:space="preserve">für den Lizenzgeber: Lizenznehmer anlegen, Tarif, Plätze, Laufzeit, Status, Firmendaten, eigene</w:t>
+      </w:r>
+      <w:r>
+        <w:t xml:space="preserve"> </w:t>
+      </w:r>
+      <w:r>
+        <w:t xml:space="preserve">Domains (Premium), Admin-Passwort zurücksetzen, gekündigte Kunden endgültig löschen, MRR-Übersicht,</w:t>
+      </w:r>
+      <w:r>
+        <w:t xml:space="preserve"> </w:t>
+      </w:r>
+      <w:r>
+        <w:t xml:space="preserve">Rechnungsvorschau je Monat.</w:t>
       </w:r>
     </w:p>
     <w:p>
@@ -1768,19 +1786,25 @@
           <w:bCs/>
           <w:b/>
         </w:rPr>
-        <w:t xml:space="preserve">Einrichtungs-Assistent</w:t>
+        <w:t xml:space="preserve">Einrichtung</w:t>
       </w:r>
       <w:r>
         <w:t xml:space="preserve"> </w:t>
       </w:r>
       <w:r>
-        <w:t xml:space="preserve">in 4 Schritten: Logo &amp; Farbe, Fahrzeuge, Fahrer (6-stellige PIN, Einladungslink/QR per</w:t>
+        <w:t xml:space="preserve">in 4 Schritten (über die Menüs, kein geführter Assistent): Logo &amp; Farbe, Fahrzeuge, Fahrer</w:t>
       </w:r>
       <w:r>
         <w:t xml:space="preserve"> </w:t>
       </w:r>
       <w:r>
-        <w:t xml:space="preserve">WhatsApp oder SMS), erste Lieferung.</w:t>
+        <w:t xml:space="preserve">(6-stellige PIN, Einladungslink/QR per WhatsApp oder SMS), erste Lieferung. Beim ersten Login vergibt der Admin</w:t>
+      </w:r>
+      <w:r>
+        <w:t xml:space="preserve"> </w:t>
+      </w:r>
+      <w:r>
+        <w:t xml:space="preserve">ein eigenes Passwort.</w:t>
       </w:r>
     </w:p>
     <w:p>
@@ -1814,7 +1838,7 @@
         <w:t xml:space="preserve"> </w:t>
       </w:r>
       <w:r>
-        <w:t xml:space="preserve">Abliefernachweis als PDF, Berichte, CSV-Export.</w:t>
+        <w:t xml:space="preserve">Abliefernachweis als PDF, Berichte je Fahrer, Auftraggeber und Lade-/Entladestelle, CSV-Export.</w:t>
       </w:r>
     </w:p>
     <w:p>
@@ -1842,7 +1866,13 @@
         <w:t xml:space="preserve"> </w:t>
       </w:r>
       <w:r>
-        <w:t xml:space="preserve">Schnellbausteine („Stau“, „Warte an Rampe“), Problem melden mit Foto, Navigation, Anrufen, Rückgängig 2 Minuten.</w:t>
+        <w:t xml:space="preserve">Schnellbausteine („Stau, ca. 30 Min. später“, „Warte an der Rampe“), Problem melden mit Foto, Navigation (Apple</w:t>
+      </w:r>
+      <w:r>
+        <w:t xml:space="preserve"> </w:t>
+      </w:r>
+      <w:r>
+        <w:t xml:space="preserve">Karten auf iPhone/iPad, sonst Google Maps), Anrufen, Rückgängig 2 Minuten (mit Netz).</w:t>
       </w:r>
     </w:p>
     <w:p>
@@ -1864,19 +1894,25 @@
         <w:t xml:space="preserve"> </w:t>
       </w:r>
       <w:r>
-        <w:t xml:space="preserve">8 Sprachen (DE, EN, PL, RO, CS, TR, RU, UK), Fahrsperre ab ca. 8 km/h,</w:t>
+        <w:t xml:space="preserve">8 Sprachen in der Fahrer-App (DE, EN, PL, RO, CS, TR, RU, UK), Fahrsperre</w:t>
       </w:r>
       <w:r>
         <w:t xml:space="preserve"> </w:t>
       </w:r>
       <w:r>
-        <w:t xml:space="preserve">Offline-Warteschlange, Foto-Pflicht vor Abschluss, Standzeit-Erfassung, Palettentausch, Fahrzeugbelegung, HU/SP-</w:t>
+        <w:t xml:space="preserve">ab ca. 8 km/h (mit Standortfreigabe, Auswertung nur auf dem Handy), Offline-Warteschlange auch für Lieferschein-Foto</w:t>
       </w:r>
       <w:r>
         <w:t xml:space="preserve"> </w:t>
       </w:r>
       <w:r>
-        <w:t xml:space="preserve">Fristen, Unterschrift, Dunkelmodus, Datenexport (EU Data Act), REST-API (Premium).</w:t>
+        <w:t xml:space="preserve">und Unterschrift, Foto-Pflicht vor Abschluss, Standzeit-Erfassung, Palettentausch, Fahrzeugbelegung, HU/SP-Fristen,</w:t>
+      </w:r>
+      <w:r>
+        <w:t xml:space="preserve"> </w:t>
+      </w:r>
+      <w:r>
+        <w:t xml:space="preserve">Unterschrift, Dunkelmodus, Personen löschen (DSGVO), Datenexport als ZIP (EU Data Act), REST-API (Premium).</w:t>
       </w:r>
     </w:p>
     <w:bookmarkEnd w:id="26"/>
@@ -1902,7 +1938,7 @@
           <w:bCs/>
           <w:b/>
         </w:rPr>
-        <w:t xml:space="preserve">Einrichten (10 Minuten):</w:t>
+        <w:t xml:space="preserve">Einrichten (ca. 10 Minuten):</w:t>
       </w:r>
       <w:r>
         <w:t xml:space="preserve"> </w:t>
@@ -2130,6 +2166,9 @@
               </w:rPr>
               <w:t xml:space="preserve">Gastzugänge für Subunternehmer-Fahrer</w:t>
             </w:r>
+            <w:r>
+              <w:t xml:space="preserve">, Push über APNs/FCM für Store-Apps</w:t>
+            </w:r>
           </w:p>
         </w:tc>
       </w:tr>
@@ -3678,7 +3717,7 @@
         <w:t xml:space="preserve"> </w:t>
       </w:r>
       <w:r>
-        <w:t xml:space="preserve">(10 Minuten, keine Hardware),</w:t>
+        <w:t xml:space="preserve">(ca. 10 Minuten, keine Hardware),</w:t>
       </w:r>
       <w:r>
         <w:t xml:space="preserve"> </w:t>
@@ -3819,7 +3858,7 @@
               <w:jc w:val="left"/>
             </w:pPr>
             <w:r>
-              <w:t xml:space="preserve">„Tippen statt telefonieren. Ab 49 € im Monat, in 10 Minuten startklar, ohne Hardware.“</w:t>
+              <w:t xml:space="preserve">„Tippen statt telefonieren. Ab 49 € im Monat, in etwa 10 Minuten startklar, ohne Hardware.“</w:t>
             </w:r>
           </w:p>
         </w:tc>
@@ -3871,7 +3910,7 @@
               <w:jc w:val="left"/>
             </w:pPr>
             <w:r>
-              <w:t xml:space="preserve">„Ein Knopf. In deiner Sprache. Kein Tracking.“</w:t>
+              <w:t xml:space="preserve">„Ein Knopf. In deiner Sprache. Keine Dauerortung.“</w:t>
             </w:r>
           </w:p>
         </w:tc>
@@ -3897,7 +3936,7 @@
               <w:jc w:val="left"/>
             </w:pPr>
             <w:r>
-              <w:t xml:space="preserve">„Keine Dauerortung. Standort nur beim Statuswechsel, Muster-Betriebsvereinbarung liegt bei.“</w:t>
+              <w:t xml:space="preserve">„Keine Dauerortung. Standort nur beim Statuswechsel und nur mit Zustimmung des Fahrers, Muster-Betriebsvereinbarung liegt bei.“</w:t>
             </w:r>
           </w:p>
         </w:tc>
@@ -4401,19 +4440,19 @@
               <w:jc w:val="left"/>
             </w:pPr>
             <w:r>
-              <w:t xml:space="preserve">Einladungslink an Fahrer, später Gastzugänge für Subunternehmer, Abliefernachweis-PDF mit „erstellt mit Ladeklar“ (abschaltbar)</w:t>
-            </w:r>
-          </w:p>
-        </w:tc>
-        <w:tc>
-          <w:tcPr/>
-          <w:p>
-            <w:pPr>
-              <w:pStyle w:val="Compact"/>
-              <w:jc w:val="left"/>
-            </w:pPr>
-            <w:r>
-              <w:t xml:space="preserve">ab v1.1</w:t>
+              <w:t xml:space="preserve">Einladungslink an Fahrer und Abliefernachweis mit „Erstellt mit Ladeklar“ (beides seit v1.0), später Gastzugänge für Subunternehmer</w:t>
+            </w:r>
+          </w:p>
+        </w:tc>
+        <w:tc>
+          <w:tcPr/>
+          <w:p>
+            <w:pPr>
+              <w:pStyle w:val="Compact"/>
+              <w:jc w:val="left"/>
+            </w:pPr>
+            <w:r>
+              <w:t xml:space="preserve">Gastzugänge ab v1.1</w:t>
             </w:r>
           </w:p>
         </w:tc>
@@ -6660,6 +6699,56 @@
             </w:pPr>
             <w:r>
               <w:t xml:space="preserve">250 GB</w:t>
+            </w:r>
+          </w:p>
+        </w:tc>
+      </w:tr>
+      <w:tr>
+        <w:tc>
+          <w:tcPr/>
+          <w:p>
+            <w:pPr>
+              <w:pStyle w:val="Compact"/>
+              <w:jc w:val="left"/>
+            </w:pPr>
+            <w:r>
+              <w:t xml:space="preserve">Berichte und CSV-Export</w:t>
+            </w:r>
+          </w:p>
+        </w:tc>
+        <w:tc>
+          <w:tcPr/>
+          <w:p>
+            <w:pPr>
+              <w:pStyle w:val="Compact"/>
+              <w:jc w:val="left"/>
+            </w:pPr>
+            <w:r>
+              <w:t xml:space="preserve">ja</w:t>
+            </w:r>
+          </w:p>
+        </w:tc>
+        <w:tc>
+          <w:tcPr/>
+          <w:p>
+            <w:pPr>
+              <w:pStyle w:val="Compact"/>
+              <w:jc w:val="left"/>
+            </w:pPr>
+            <w:r>
+              <w:t xml:space="preserve">ja</w:t>
+            </w:r>
+          </w:p>
+        </w:tc>
+        <w:tc>
+          <w:tcPr/>
+          <w:p>
+            <w:pPr>
+              <w:pStyle w:val="Compact"/>
+              <w:jc w:val="left"/>
+            </w:pPr>
+            <w:r>
+              <w:t xml:space="preserve">ja</w:t>
             </w:r>
           </w:p>
         </w:tc>
@@ -8687,7 +8776,25 @@
         <w:t xml:space="preserve"> </w:t>
       </w:r>
       <w:r>
-        <w:t xml:space="preserve">bei einem deutschen Anbieter, verschlüsselte Backups täglich, Wiederherstellung monatlich</w:t>
+        <w:t xml:space="preserve">(geplant) bei einem deutschen Anbieter; Vorlage für Docker, Caddy (HTTPS) und tägliche</w:t>
+      </w:r>
+      <w:r>
+        <w:t xml:space="preserve"> </w:t>
+      </w:r>
+      <w:r>
+        <w:t xml:space="preserve">Sicherung liegt in</w:t>
+      </w:r>
+      <w:r>
+        <w:t xml:space="preserve"> </w:t>
+      </w:r>
+      <w:r>
+        <w:rPr>
+          <w:rStyle w:val="VerbatimChar"/>
+        </w:rPr>
+        <w:t xml:space="preserve">deploy/</w:t>
+      </w:r>
+      <w:r>
+        <w:t xml:space="preserve">. Geplant zusätzlich: verschlüsselter Speicherort für die Backups, Wiederherstellung monatlich</w:t>
       </w:r>
       <w:r>
         <w:t xml:space="preserve"> </w:t>
@@ -8761,13 +8868,19 @@
         <w:t xml:space="preserve"> </w:t>
       </w:r>
       <w:r>
-        <w:t xml:space="preserve">Passwörter mit scrypt, Login-Sperre, Sicherheits-Header, Typprüfung bei Uploads, Audit-Log,</w:t>
+        <w:t xml:space="preserve">Passwörter mit scrypt, eigenes Passwort beim ersten Login erzwungen, Login-Sperre nach 5 Fehlversuchen,</w:t>
       </w:r>
       <w:r>
         <w:t xml:space="preserve"> </w:t>
       </w:r>
       <w:r>
-        <w:t xml:space="preserve">keine externen Schriften und Tracker, Datenexport jederzeit.</w:t>
+        <w:t xml:space="preserve">Sicherheits-Header, Typprüfung bei Uploads, Audit-Log mit Anmeldungen und Fehlversuchen (IP nach 90 Tagen</w:t>
+      </w:r>
+      <w:r>
+        <w:t xml:space="preserve"> </w:t>
+      </w:r>
+      <w:r>
+        <w:t xml:space="preserve">entfernt), keine externen Schriften und Tracker, Datenexport jederzeit durch den Admin.</w:t>
       </w:r>
     </w:p>
     <w:p>
@@ -8829,7 +8942,13 @@
         <w:t xml:space="preserve"> </w:t>
       </w:r>
       <w:r>
-        <w:t xml:space="preserve">Store-Texte, Prüfung und erste Veröffentlichung; 99 € je Monat decken Updates.</w:t>
+        <w:t xml:space="preserve">Store-Texte, Prüfung und erste Veröffentlichung; 99 € je Monat decken Updates. Push über APNs/FCM für die Store-App</w:t>
+      </w:r>
+      <w:r>
+        <w:t xml:space="preserve"> </w:t>
+      </w:r>
+      <w:r>
+        <w:t xml:space="preserve">ist noch zu bauen (Roadmap v1.1); bis dahin gilt Web-Push.</w:t>
       </w:r>
     </w:p>
     <w:p>
@@ -8857,7 +8976,13 @@
         <w:t xml:space="preserve"> </w:t>
       </w:r>
       <w:r>
-        <w:t xml:space="preserve">Zahlung, Karten 1,5 % + 0,25 € [Q78]); im Modell 0,8 % vom Umsatz + 0,35 € je Kunde und Monat.</w:t>
+        <w:t xml:space="preserve">Zahlung, Karten 1,5 % + 0,25 € [Q78]); im Modell 0,8 % vom Umsatz + 0,35 € je Kunde und Monat. Heute zeigt die</w:t>
+      </w:r>
+      <w:r>
+        <w:t xml:space="preserve"> </w:t>
+      </w:r>
+      <w:r>
+        <w:t xml:space="preserve">Konsole eine Rechnungsvorschau je Monat mit CSV-Export; Rechnungen und Lastschrift laufen bis v1.2 außerhalb der App.</w:t>
       </w:r>
     </w:p>
     <w:p>
@@ -16447,7 +16572,7 @@
               <w:jc w:val="left"/>
             </w:pPr>
             <w:r>
-              <w:t xml:space="preserve">Ein-Knopf-Bedienung, 8 Sprachen, Einladung per WhatsApp, Erfolgsquote je Fahrer im Board, Einführungsschulung per Video in der Muttersprache</w:t>
+              <w:t xml:space="preserve">Ein-Knopf-Bedienung, 8 Sprachen, Einladung per WhatsApp, Lieferungen je Fahrer im Bericht (abschaltbar), Einführungsschulung per Video in der Muttersprache</w:t>
             </w:r>
           </w:p>
         </w:tc>
@@ -16797,7 +16922,7 @@
               <w:jc w:val="left"/>
             </w:pPr>
             <w:r>
-              <w:t xml:space="preserve">AVV, TOM, Mandantentest, Support-Zugriff nur mit Freigabe, externer DSB, Cyber-Versicherung</w:t>
+              <w:t xml:space="preserve">AVV, TOM, Mandantentest, kein Zugriff des Lizenzgebers auf Auftragsdaten, Löschen von Personen, externer DSB, Cyber-Versicherung</w:t>
             </w:r>
           </w:p>
         </w:tc>
@@ -17070,7 +17195,7 @@
               <w:jc w:val="left"/>
             </w:pPr>
             <w:r>
-              <w:t xml:space="preserve">transport logistic, v1.1 (Zwischenstopps, Gastzugänge, CS/BG)</w:t>
+              <w:t xml:space="preserve">transport logistic, v1.1 (Zwischenstopps, Gastzugänge, Bulgarisch)</w:t>
             </w:r>
           </w:p>
         </w:tc>

</xml_diff>